<commit_message>
Refresh spray bottle imagery across pages and address nine visual comments
</commit_message>
<xml_diff>
--- a/spray/商品說明-長效安鋅抗菌噴劑200mL.docx
+++ b/spray/商品說明-長效安鋅抗菌噴劑200mL.docx
@@ -29,7 +29,7 @@
         </w:pBdr>
       </w:pPr>
       <w:r>
-        <w:t>STC Nanotech  200 mL  單瓶定價 NT$450  TWD</w:t>
+        <w:t>STC Nanotech  200 mL NT$450  250 mL補充瓶 NT$400  TWD</w:t>
       </w:r>
     </w:p>
     <w:p>
@@ -271,14 +271,8 @@
             </w:tcMar>
           </w:tcPr>
           <w:p>
-            <w:pPr>
-              <w:spacing w:after="60" w:line="264" w:lineRule="auto"/>
-            </w:pPr>
             <w:r>
-              <w:rPr>
-                <w:sz w:val="19"/>
-              </w:rPr>
-              <w:t>STC Nanotech／200 mL 單瓶</w:t>
+              <w:t>STC Nanotech／200 mL 噴霧瓶；250 mL 補充瓶</w:t>
             </w:r>
           </w:p>
         </w:tc>
@@ -331,14 +325,8 @@
             </w:tcMar>
           </w:tcPr>
           <w:p>
-            <w:pPr>
-              <w:spacing w:after="60" w:line="264" w:lineRule="auto"/>
-            </w:pPr>
             <w:r>
-              <w:rPr>
-                <w:sz w:val="19"/>
-              </w:rPr>
-              <w:t>NT$450／TWD 新台幣</w:t>
+              <w:t>200 mL NT$450；250 mL NT$400／TWD 新台幣</w:t>
             </w:r>
           </w:p>
         </w:tc>
@@ -1940,6 +1928,35 @@
         </w:r>
       </w:hyperlink>
     </w:p>
+    <w:p>
+      <w:pPr>
+        <w:pStyle w:val="Heading1"/>
+        <w:pageBreakBefore/>
+      </w:pPr>
+      <w:r>
+        <w:t>規格與使用依據更新</w:t>
+      </w:r>
+    </w:p>
+    <w:p>
+      <w:r>
+        <w:t>2026年10月22日依品牌提供資料新增250 mL補充瓶，定價NT$400（TWD）。200 mL噴霧瓶維持NT$450；兩者分開管理。補充瓶的現售標籤、完整成分及檢驗關聯須另核對。</w:t>
+      </w:r>
+    </w:p>
+    <w:p>
+      <w:r>
+        <w:t>九項畫面註記已保存於隨附紀錄。瓶底圖片全站更新，廣告圖以水性配方、不含酒精及次氯酸（原廠資料）、寵物用品與日常物品照顧為訴求。包裝圖為示意，外盒尚未經實物核對。</w:t>
+      </w:r>
+    </w:p>
+    <w:p>
+      <w:r>
+        <w:t>輔大20220406-A-2的無細胞毒性結論適用奈米銀混氧化鋅不織布。20220406-A-1記錄L929直接接觸24小時、1% ZnO spray存活率3.6%，英文結論為cytotoxic。使用者對判讀提出異議，需由原實驗室釐清指標、判讀、濃度及與現售配方的關聯。這些資料不作現售商品人體或寵物安全／毒性的直接結論，亦不新增手部適用或寵物直接使用宣稱。</w:t>
+      </w:r>
+    </w:p>
+    <w:p>
+      <w:r>
+        <w:t>官方蝦皮與STC OPTICS官網列為雙通路規劃。尚未核實兩通路的正式商品頁、庫存或結帳狀態，因此不標示已正式上市。Shopify另附250 mL待核對草稿CSV，Price400.00只適用已確認商店基準幣別為TWD的情況。</w:t>
+      </w:r>
+    </w:p>
     <w:sectPr>
       <w:pgSz w:w="11906" w:h="16838"/>
       <w:pgMar w:top="1020" w:right="1134" w:bottom="1020" w:left="1134" w:header="720" w:footer="720" w:gutter="0"/>

</xml_diff>